<commit_message>
Clarify regional roles and roadmap status
</commit_message>
<xml_diff>
--- a/docs/rapporten/plan-van-aanpak-v1.docx
+++ b/docs/rapporten/plan-van-aanpak-v1.docx
@@ -7,7 +7,7 @@
         <w:pStyle w:val="Heading1"/>
       </w:pPr>
       <w:r>
-        <w:t>Plan van Aanpak Almere: AZWA D5, D6 en D7 (Bijlage D5 werkagenda)</w:t>
+        <w:t>Plan van aanpak AZWA Almere</w:t>
       </w:r>
     </w:p>
     <w:p>
@@ -15,10 +15,10 @@
         <w:rPr>
           <w:b/>
         </w:rPr>
-        <w:t>Versie 1: kort en krachtig</w:t>
+        <w:t>Conceptversie voor ambtelijke en bestuurlijke beoordeling</w:t>
       </w:r>
       <w:r>
-        <w:t xml:space="preserve"> Bron: Aanvullend Zorg- en Welzijnsakkoord, versie 1.0, augustus 2025. Content p60-66 (D5, D6, D7) en p100-104 (Bijlage D5). Peildatum: 2026-04-22.</w:t>
+        <w:t xml:space="preserve"> Peildatum: 22 april 2026. Bronbasis: beschikbare landelijke, regionale en lokale openbare stukken tot en met 22 april 2026.</w:t>
       </w:r>
     </w:p>
     <w:p>
@@ -26,12 +26,22 @@
         <w:pStyle w:val="Heading2"/>
       </w:pPr>
       <w:r>
-        <w:t>Inleiding en aanleiding</w:t>
+        <w:t>1. Aanleiding</w:t>
       </w:r>
     </w:p>
     <w:p>
       <w:r>
-        <w:t>Het AZWA regelt op p60-66 de afspraken die Almere direct raken: D5 (versterken samenwerking (eerstelijns)zorg × sociaal domein), D6 (basisinfrastructuur sociaal domein) en D7 (ANW- en crisisdiensten). De bijlage op p100-104 beschrijft het mechanisme: landelijk het "wat" (basisfunctionaliteiten en gereedschapskist), lokaal het "hoe".</w:t>
+        <w:t>Met het Aanvullend Zorg- en Welzijnsakkoord (AZWA) zijn aanvullende afspraken gemaakt op het Integraal Zorgakkoord (IZA) en het Gezond en Actief Leven Akkoord (GALA). Voor gemeenten zijn vooral de uitwerking van D5 en D6 relevant: de basisfunctionaliteiten in het sociaal domein en de sociale en gezonde basisinfrastructuur.</w:t>
+      </w:r>
+    </w:p>
+    <w:p>
+      <w:r>
+        <w:t>De landelijke lijn is in 2025 en 2026 verder geconcretiseerd. Daarbij zijn onder meer het definitieve AZWA van 31 augustus 2025, het CW 3.1-kader D5/D6 van 10 maart 2026, de voortgangsbrief IZA/AZWA van 9 april 2026 en de VNG-publicatie over AZWA-financiering voor gemeenten van 22 april 2026 relevant.</w:t>
+      </w:r>
+    </w:p>
+    <w:p>
+      <w:r>
+        <w:t>Voor Almere betekent dit dat de aandacht verschuift naar lokale vertaling: welke onderdelen worden lokaal uitgewerkt, hoe sluiten die aan op Flevolandse afspraken, welke bestuurlijke keuzes zijn nodig en welke punten vragen nog om nadere beoordeling.</w:t>
       </w:r>
     </w:p>
     <w:p>
@@ -39,12 +49,57 @@
         <w:pStyle w:val="Heading2"/>
       </w:pPr>
       <w:r>
-        <w:t>Probleemanalyse en lokale opgave</w:t>
+        <w:t>2. Doel van dit plan</w:t>
       </w:r>
     </w:p>
     <w:p>
       <w:r>
-        <w:t>Almere moet op vier leefgebieden basisfunctionaliteiten voor iedere inwoner beschikbaar maken: Kansrijk opgroeien, Gezonde leefstijl, Mentale gezondheid en Vitaal ouder worden. Het verminderen van gezondheidsachterstanden en vergroten van zelfredzaamheid loopt als rode draad door deze vier thema's. Daarnaast moet Almere een D6-basisinfrastructuur inrichten (inloopvoorzieningen sociaal en gezond, lokale teams, (Mentale) gezonde school, buursportcoaches, suïcidepreventie, coördinatie). D7 ligt primair bij ggz-partners en zorgverzekeraar; Almere faciliteert.</w:t>
+        <w:t>Dit concept ordent de opgave voor Almere op basis van de beschikbare openbare bronnen. Het plan legt nog geen lokale keuzes vast. Het benoemt welke onderwerpen bestuurlijk en ambtelijk moeten worden uitgewerkt voordat sprake kan zijn van een vastgesteld lokaal uitvoeringskader.</w:t>
+      </w:r>
+    </w:p>
+    <w:p>
+      <w:r>
+        <w:t>Het doel is om:</w:t>
+      </w:r>
+    </w:p>
+    <w:p>
+      <w:pPr>
+        <w:pStyle w:val="ListBullet"/>
+      </w:pPr>
+      <w:r>
+        <w:t>de lokale opgave rond D5 en D6 overzichtelijk te maken;</w:t>
+      </w:r>
+    </w:p>
+    <w:p>
+      <w:pPr>
+        <w:pStyle w:val="ListBullet"/>
+      </w:pPr>
+      <w:r>
+        <w:t>te onderscheiden wat uit landelijke en regionale bronnen volgt en wat lokaal nog bepaald moet worden;</w:t>
+      </w:r>
+    </w:p>
+    <w:p>
+      <w:pPr>
+        <w:pStyle w:val="ListBullet"/>
+      </w:pPr>
+      <w:r>
+        <w:t>bestuurlijke keuzevragen zichtbaar te maken;</w:t>
+      </w:r>
+    </w:p>
+    <w:p>
+      <w:pPr>
+        <w:pStyle w:val="ListBullet"/>
+      </w:pPr>
+      <w:r>
+        <w:t>de relatie met financiering, regionale samenwerking en monitoring te benoemen;</w:t>
+      </w:r>
+    </w:p>
+    <w:p>
+      <w:pPr>
+        <w:pStyle w:val="ListBullet"/>
+      </w:pPr>
+      <w:r>
+        <w:t>een basis te bieden voor verdere ambtelijke en bestuurlijke uitwerking.</w:t>
       </w:r>
     </w:p>
     <w:p>
@@ -52,7 +107,90 @@
         <w:pStyle w:val="Heading2"/>
       </w:pPr>
       <w:r>
-        <w:t>Ambitie en Doelstellingen</w:t>
+        <w:t>3. Bronbasis en lokale uitgangssituatie</w:t>
+      </w:r>
+    </w:p>
+    <w:p>
+      <w:r>
+        <w:t>De beschikbare landelijke stukken geven een basis voor D5 en D6. De recente VNG- en VWS-documenten van 22 april 2026 maken daarnaast duidelijker dat financiering, regionale werkagenda en gemeentelijke uitwerking met elkaar samenhangen.</w:t>
+      </w:r>
+    </w:p>
+    <w:p>
+      <w:r>
+        <w:t>De beschikbare Almeerse stukken bieden aanknopingspunten voor gezondheid, preventie, sociaal domein en Positief Gezond Almere. Het gaat onder meer om de Visie Gezondheidsbeleid Almere 2024-2026, de Maatschappelijke agenda 2024-2034, het Transformatieplan Positief Gezond Almere, de SEO-businesscase, de informatiepagina Sociaal Domein en informatie over de Sociale staat van Almere.</w:t>
+      </w:r>
+    </w:p>
+    <w:p>
+      <w:r>
+        <w:t>In die openbare stukken is nog niet volledig uitgewerkt hoe Almere D5 en D6 als lokaal AZWA-kader wil vertalen. Daardoor ligt de opgave vooral in het expliciteren van lokale keuzes, rolverdeling, middelen, regionale aansluiting en monitoring.</w:t>
+      </w:r>
+    </w:p>
+    <w:p>
+      <w:pPr>
+        <w:pStyle w:val="Heading2"/>
+      </w:pPr>
+      <w:r>
+        <w:t>4. Lokale opgave</w:t>
+      </w:r>
+    </w:p>
+    <w:p>
+      <w:r>
+        <w:t>Op basis van de beschikbare stukken komen vier lokale uitwerkingsvragen naar voren.</w:t>
+      </w:r>
+    </w:p>
+    <w:p>
+      <w:pPr>
+        <w:pStyle w:val="ListNumber"/>
+      </w:pPr>
+      <w:r>
+        <w:t>Hoe vertaalt Almere de landelijke D5-basisfunctionaliteiten naar lokale prioriteiten, doelgroepen en aanpakken?</w:t>
+      </w:r>
+    </w:p>
+    <w:p>
+      <w:pPr>
+        <w:pStyle w:val="ListNumber"/>
+      </w:pPr>
+      <w:r>
+        <w:t>Hoe beschrijft Almere de lokale D6-structuur, waaronder lokale teams, wijkverbanden en aansluiting op de sociale en gezonde basisinfrastructuur?</w:t>
+      </w:r>
+    </w:p>
+    <w:p>
+      <w:pPr>
+        <w:pStyle w:val="ListNumber"/>
+      </w:pPr>
+      <w:r>
+        <w:t>Hoe wordt de inzet van beschikbare en verwachte middelen lokaal en regionaal verbonden aan D5 en D6?</w:t>
+      </w:r>
+    </w:p>
+    <w:p>
+      <w:pPr>
+        <w:pStyle w:val="ListNumber"/>
+      </w:pPr>
+      <w:r>
+        <w:t>Hoe sluit Almere lokale monitoring aan op regionale en landelijke voortgangs- en evaluatiemomenten?</w:t>
+      </w:r>
+    </w:p>
+    <w:p>
+      <w:r>
+        <w:t>Deze vragen zijn nog geen besluiten. Ze markeren de onderdelen die bestuurlijk en ambtelijk moeten worden ingevuld.</w:t>
+      </w:r>
+    </w:p>
+    <w:p>
+      <w:pPr>
+        <w:pStyle w:val="Heading2"/>
+      </w:pPr>
+      <w:r>
+        <w:t>5. Afbakening</w:t>
+      </w:r>
+    </w:p>
+    <w:p>
+      <w:r>
+        <w:t>Dit concept richt zich op D5 en D6. Die afbakening sluit aan bij de beschikbare landelijke uitwerking en de recente financieringsinformatie voor gemeenten.</w:t>
+      </w:r>
+    </w:p>
+    <w:p>
+      <w:r>
+        <w:t>Binnen scope vallen:</w:t>
       </w:r>
     </w:p>
     <w:p>
@@ -60,7 +198,7 @@
         <w:pStyle w:val="ListBullet"/>
       </w:pPr>
       <w:r>
-        <w:t>De vijf reeds onderbouwde basisfunctionaliteiten (laagdrempelige steunpunten EPA, Sociaal Verwijzen, Valpreventie, GLI volwassenen, Kansrijke Start inclusief integrale gezinspoli en Nu Niet Zwanger) overal beschikbaar in Almere.</w:t>
+        <w:t>lokale vertaling van D5;</w:t>
       </w:r>
     </w:p>
     <w:p>
@@ -68,7 +206,7 @@
         <w:pStyle w:val="ListBullet"/>
       </w:pPr>
       <w:r>
-        <w:t>Stevige lokale teams aangesloten op alle hechte wijkverbanden uiterlijk Q4 2028.</w:t>
+        <w:t>lokale en regionale uitwerking van D6;</w:t>
       </w:r>
     </w:p>
     <w:p>
@@ -76,7 +214,7 @@
         <w:pStyle w:val="ListBullet"/>
       </w:pPr>
       <w:r>
-        <w:t>Almeerse inbreng in regionaal aanvullend plan uiterlijk eind september 2026.</w:t>
+        <w:t>bestuurlijke rolverdeling en samenwerking;</w:t>
       </w:r>
     </w:p>
     <w:p>
@@ -84,7 +222,76 @@
         <w:pStyle w:val="ListBullet"/>
       </w:pPr>
       <w:r>
-        <w:t>Landelijke dekking basisfunctionaliteiten gerealiseerd vanaf 2030.</w:t>
+        <w:t>relatie met regionale werkagenda en Flevolandse afspraken;</w:t>
+      </w:r>
+    </w:p>
+    <w:p>
+      <w:pPr>
+        <w:pStyle w:val="ListBullet"/>
+      </w:pPr>
+      <w:r>
+        <w:t>financieringsroute en middelen als aandachtspunt;</w:t>
+      </w:r>
+    </w:p>
+    <w:p>
+      <w:pPr>
+        <w:pStyle w:val="ListBullet"/>
+      </w:pPr>
+      <w:r>
+        <w:t>monitoring en verantwoording als uitwerkingsvraag.</w:t>
+      </w:r>
+    </w:p>
+    <w:p>
+      <w:r>
+        <w:t>Buiten scope vallen:</w:t>
+      </w:r>
+    </w:p>
+    <w:p>
+      <w:pPr>
+        <w:pStyle w:val="ListBullet"/>
+      </w:pPr>
+      <w:r>
+        <w:t>individuele contractering;</w:t>
+      </w:r>
+    </w:p>
+    <w:p>
+      <w:pPr>
+        <w:pStyle w:val="ListBullet"/>
+      </w:pPr>
+      <w:r>
+        <w:t>zelfstandige vaststelling van landelijke normen;</w:t>
+      </w:r>
+    </w:p>
+    <w:p>
+      <w:pPr>
+        <w:pStyle w:val="ListBullet"/>
+      </w:pPr>
+      <w:r>
+        <w:t>concrete personele inzet;</w:t>
+      </w:r>
+    </w:p>
+    <w:p>
+      <w:pPr>
+        <w:pStyle w:val="ListBullet"/>
+      </w:pPr>
+      <w:r>
+        <w:t>lokale budgetverdeling;</w:t>
+      </w:r>
+    </w:p>
+    <w:p>
+      <w:pPr>
+        <w:pStyle w:val="ListBullet"/>
+      </w:pPr>
+      <w:r>
+        <w:t>definitieve interne planning;</w:t>
+      </w:r>
+    </w:p>
+    <w:p>
+      <w:pPr>
+        <w:pStyle w:val="ListBullet"/>
+      </w:pPr>
+      <w:r>
+        <w:t>keuzes die niet uit de openbare bronbasis volgen.</w:t>
       </w:r>
     </w:p>
     <w:p>
@@ -92,12 +299,65 @@
         <w:pStyle w:val="Heading2"/>
       </w:pPr>
       <w:r>
-        <w:t>Scope en afbakening</w:t>
+        <w:t>6. Te maken bestuurlijke keuzes</w:t>
       </w:r>
     </w:p>
     <w:p>
       <w:r>
-        <w:t>In scope: D5 onderbouwde basisfunctionaliteiten en ontwikkelagenda 1, D6 basisinfrastructuur, faciliterende rol bij D7. Uit scope: ontwikkelagenda 2, beheer landelijke gereedschapskist, wetgevingstraject gezondheidstaken, individuele zorgcontractering. Doorbraakmiddelen zijn alleen toegankelijk via een Zvw-aanbieder; gemeenten kunnen niet zelfstandig aanvragen (p63 noot 33).</w:t>
+        <w:t>De beschikbare bronnen wijzen op een aantal onderwerpen waar lokale besluitvorming of nadere bestuurlijke richting nodig kan zijn. De precieze besluitvormingsroute moet door Almere zelf worden bepaald.</w:t>
+      </w:r>
+    </w:p>
+    <w:p>
+      <w:r>
+        <w:t>Te beoordelen keuzevragen zijn:</w:t>
+      </w:r>
+    </w:p>
+    <w:p>
+      <w:pPr>
+        <w:pStyle w:val="ListBullet"/>
+      </w:pPr>
+      <w:r>
+        <w:t>welke D5-onderdelen Almere als eerste lokaal wil uitwerken;</w:t>
+      </w:r>
+    </w:p>
+    <w:p>
+      <w:pPr>
+        <w:pStyle w:val="ListBullet"/>
+      </w:pPr>
+      <w:r>
+        <w:t>hoe Almere D6 bestuurlijk en organisatorisch wil positioneren;</w:t>
+      </w:r>
+    </w:p>
+    <w:p>
+      <w:pPr>
+        <w:pStyle w:val="ListBullet"/>
+      </w:pPr>
+      <w:r>
+        <w:t>hoe lokale en regionale verantwoordelijkheden worden verdeeld;</w:t>
+      </w:r>
+    </w:p>
+    <w:p>
+      <w:pPr>
+        <w:pStyle w:val="ListBullet"/>
+      </w:pPr>
+      <w:r>
+        <w:t>hoe beschikbare of verwachte middelen worden verbonden aan lokale en regionale inzet;</w:t>
+      </w:r>
+    </w:p>
+    <w:p>
+      <w:pPr>
+        <w:pStyle w:val="ListBullet"/>
+      </w:pPr>
+      <w:r>
+        <w:t>welke informatie nodig is om voortgang, effecten en afhankelijkheden te volgen;</w:t>
+      </w:r>
+    </w:p>
+    <w:p>
+      <w:pPr>
+        <w:pStyle w:val="ListBullet"/>
+      </w:pPr>
+      <w:r>
+        <w:t>hoe de raad wordt betrokken bij keuzes over middelen, uitvoering en voortgang.</w:t>
       </w:r>
     </w:p>
     <w:p>
@@ -105,12 +365,70 @@
         <w:pStyle w:val="Heading2"/>
       </w:pPr>
       <w:r>
-        <w:t>Samenwerking en governance (rollen en betrokkenen, besluitvorming)</w:t>
+        <w:t>7. Regionale samenwerking</w:t>
       </w:r>
     </w:p>
     <w:p>
       <w:r>
-        <w:t>Trekker: gemeente Almere, portefeuilles sociaal domein en gezondheid. Regionale partners: GGD Flevoland (coördinatie ketenaanpakken en preventie-infrastructuur), mandaatgemeente regioplan, zorgverzekeraars, RHO huisartsen, ggz, sociaal werk, aanbieders. Landelijk: BO IZA/AZWA (trekkers VNG, ZN, VWS) en kennispartners (Zorginstituut, GGD GHOR Nederland, SWN, Trimbos, RIVM, Movisie, NJi). Besluitvorming landelijk Q4 2025; lokaal via college- en raadinformatiebrieven binnen reguliere P&amp;C-cyclus.</w:t>
+        <w:t>De AZWA-uitwerking voor D5 en D6 staat niet los van regionale samenwerking. De recente stukken leggen nadruk op de regionale werkagenda, de rol van gemeenten en zorgverzekeraars en de samenhang tussen lokale en regionale middelen. Daarbij moet steeds duidelijk zijn welke regionale schaal wordt bedoeld: de IZA/AZWA-regio Flevoland, de GGD-regio Flevoland, de zorgkantoorregio of een praktische subregionale aanpak.</w:t>
+      </w:r>
+    </w:p>
+    <w:p>
+      <w:r>
+        <w:t>Voor Almere vraagt dit om nadere uitwerking van:</w:t>
+      </w:r>
+    </w:p>
+    <w:p>
+      <w:pPr>
+        <w:pStyle w:val="ListBullet"/>
+      </w:pPr>
+      <w:r>
+        <w:t>de aansluiting op de IZA/AZWA-regio Flevoland;</w:t>
+      </w:r>
+    </w:p>
+    <w:p>
+      <w:pPr>
+        <w:pStyle w:val="ListBullet"/>
+      </w:pPr>
+      <w:r>
+        <w:t>de formele rol van de mandaatgemeente waar dat voor middelen of verantwoording relevant is;</w:t>
+      </w:r>
+    </w:p>
+    <w:p>
+      <w:pPr>
+        <w:pStyle w:val="ListBullet"/>
+      </w:pPr>
+      <w:r>
+        <w:t>de praktische taakverdeling voor coordinatie, uitvoering en subregionale onderdelen;</w:t>
+      </w:r>
+    </w:p>
+    <w:p>
+      <w:pPr>
+        <w:pStyle w:val="ListBullet"/>
+      </w:pPr>
+      <w:r>
+        <w:t>de verhouding tussen lokale uitvoering en regionale afspraken;</w:t>
+      </w:r>
+    </w:p>
+    <w:p>
+      <w:pPr>
+        <w:pStyle w:val="ListBullet"/>
+      </w:pPr>
+      <w:r>
+        <w:t>de betrokkenheid van zorg- en welzijnspartijen;</w:t>
+      </w:r>
+    </w:p>
+    <w:p>
+      <w:pPr>
+        <w:pStyle w:val="ListBullet"/>
+      </w:pPr>
+      <w:r>
+        <w:t>de wijze waarop lokale keuzes herkenbaar terugkomen in regionale documenten.</w:t>
+      </w:r>
+    </w:p>
+    <w:p>
+      <w:r>
+        <w:t>Dit plan vult die rolverdeling niet zelf in. De rolverdeling moet bestuurlijk en ambtelijk worden vastgesteld.</w:t>
       </w:r>
     </w:p>
     <w:p>
@@ -118,12 +436,57 @@
         <w:pStyle w:val="Heading2"/>
       </w:pPr>
       <w:r>
-        <w:t>Aanpak en strategie</w:t>
+        <w:t>8. Financiering en middelen</w:t>
       </w:r>
     </w:p>
     <w:p>
       <w:r>
-        <w:t>Drie sporen: (1) onderbouwde basisfunctionaliteiten snel borgen; (2) ontwikkelagenda 1 lokaal klaarzetten voor Q1 2026-landing; (3) D6-infrastructuur positioneren als lokale drager. Gebruik van bestaande gereedschapskist (o.a. Vallen Verleden Tijd, In Balans, Thuis Onbezorgd Mobiel) in plaats van eigen interventies. Aansluiten op bestaande overlegstructuren, geen extra lagen.</w:t>
+        <w:t>De landelijke bekostigingsroute voor gemeenten is nog in uitwerking. De beschikbare bronnen wijzen op betrokkenheid van VNG, fondsbeheerders en VWS, op de voorziene AZWA-SPUK voor 2027-2029 en op de koppeling tussen middelen en regionale werkagenda.</w:t>
+      </w:r>
+    </w:p>
+    <w:p>
+      <w:r>
+        <w:t>Voor Almere betekent dit dat financiele uitwerking nodig is, maar dat dit concept geen lokale bedragen, verdeelsleutels of scenario's vaststelt. Te bepalen is:</w:t>
+      </w:r>
+    </w:p>
+    <w:p>
+      <w:pPr>
+        <w:pStyle w:val="ListBullet"/>
+      </w:pPr>
+      <w:r>
+        <w:t>welke landelijke en regionale middelen voor Almere relevant zijn;</w:t>
+      </w:r>
+    </w:p>
+    <w:p>
+      <w:pPr>
+        <w:pStyle w:val="ListBullet"/>
+      </w:pPr>
+      <w:r>
+        <w:t>welke voorwaarden gelden voor inzet of aanvraag van middelen;</w:t>
+      </w:r>
+    </w:p>
+    <w:p>
+      <w:pPr>
+        <w:pStyle w:val="ListBullet"/>
+      </w:pPr>
+      <w:r>
+        <w:t>hoe lokale en regionale middelen van elkaar worden onderscheiden;</w:t>
+      </w:r>
+    </w:p>
+    <w:p>
+      <w:pPr>
+        <w:pStyle w:val="ListBullet"/>
+      </w:pPr>
+      <w:r>
+        <w:t>welke financiele informatie nodig is voor begroting, besluitvorming en verantwoording;</w:t>
+      </w:r>
+    </w:p>
+    <w:p>
+      <w:pPr>
+        <w:pStyle w:val="ListBullet"/>
+      </w:pPr>
+      <w:r>
+        <w:t>welke lokale scenario's of keuzes ambtelijk en bestuurlijk moeten worden voorbereid.</w:t>
       </w:r>
     </w:p>
     <w:p>
@@ -131,7 +494,17 @@
         <w:pStyle w:val="Heading2"/>
       </w:pPr>
       <w:r>
-        <w:t>Actielijnen, werkpakketten</w:t>
+        <w:t>9. Planning en externe ijkmomenten</w:t>
+      </w:r>
+    </w:p>
+    <w:p>
+      <w:r>
+        <w:t>De beschikbare bronnen bevatten verschillende externe ijkmomenten. Deze kunnen relevant zijn voor de lokale planning, maar bepalen niet automatisch de interne planning van Almere.</w:t>
+      </w:r>
+    </w:p>
+    <w:p>
+      <w:r>
+        <w:t>Brongebaseerde ijkmomenten zijn onder meer:</w:t>
       </w:r>
     </w:p>
     <w:p>
@@ -139,7 +512,7 @@
         <w:pStyle w:val="ListBullet"/>
       </w:pPr>
       <w:r>
-        <w:t>WP1 Basisfunctionaliteiten onderbouwd (D5 kolom 1).</w:t>
+        <w:t>de VNG- en VWS-publicaties van 22 april 2026 over AZWA-financiering en werkagenda;</w:t>
       </w:r>
     </w:p>
     <w:p>
@@ -147,7 +520,7 @@
         <w:pStyle w:val="ListBullet"/>
       </w:pPr>
       <w:r>
-        <w:t>WP2 Ontwikkelagenda 1 (Verkennend Gesprek, Ketenaanpak dementie incl. preventie, Ketenaanpak overgewicht kinderen, Rookvrije start, Multiproblematiek aanpak NPLV).</w:t>
+        <w:t>het webinar van 23 april 2026 over AZWA-middelen en regionale werkagenda;</w:t>
       </w:r>
     </w:p>
     <w:p>
@@ -155,7 +528,7 @@
         <w:pStyle w:val="ListBullet"/>
       </w:pPr>
       <w:r>
-        <w:t>WP3 Basisinfrastructuur D6.</w:t>
+        <w:t>de landelijke thematafel Medisch-Sociaal en Preventie van 26 mei 2026;</w:t>
       </w:r>
     </w:p>
     <w:p>
@@ -163,7 +536,7 @@
         <w:pStyle w:val="ListBullet"/>
       </w:pPr>
       <w:r>
-        <w:t>WP4 Regionale coördinatie en aangevuld regioplan.</w:t>
+        <w:t>de praktische voorbereiding richting een regionale werkagenda in 2026;</w:t>
       </w:r>
     </w:p>
     <w:p>
@@ -171,7 +544,7 @@
         <w:pStyle w:val="ListBullet"/>
       </w:pPr>
       <w:r>
-        <w:t>WP5 Faciliteren D7 ANW/crisisdiensten.</w:t>
+        <w:t>de vaststellingstermijn van 15 november 2026 voor de regionale werkagenda;</w:t>
       </w:r>
     </w:p>
     <w:p>
@@ -179,7 +552,28 @@
         <w:pStyle w:val="ListBullet"/>
       </w:pPr>
       <w:r>
-        <w:t>WP6 Financiën, meicirculaire en verantwoording.</w:t>
+        <w:t>de voorziene AZWA-SPUK voor 2027-2029;</w:t>
+      </w:r>
+    </w:p>
+    <w:p>
+      <w:pPr>
+        <w:pStyle w:val="ListBullet"/>
+      </w:pPr>
+      <w:r>
+        <w:t>evaluatie- en herijkingsmomenten richting 2028;</w:t>
+      </w:r>
+    </w:p>
+    <w:p>
+      <w:pPr>
+        <w:pStyle w:val="ListBullet"/>
+      </w:pPr>
+      <w:r>
+        <w:t>de landelijke ambitie richting 2030.</w:t>
+      </w:r>
+    </w:p>
+    <w:p>
+      <w:r>
+        <w:t>De interne planning voor Almere moet nog worden bepaald. Daarbij moet worden vastgesteld welke producten nodig zijn, wie daarvoor verantwoordelijk is en via welke bestuurlijke route besluitvorming plaatsvindt.</w:t>
       </w:r>
     </w:p>
     <w:p>
@@ -187,12 +581,70 @@
         <w:pStyle w:val="Heading2"/>
       </w:pPr>
       <w:r>
-        <w:t>Personele inzet</w:t>
+        <w:t>10. Capaciteit en organisatie</w:t>
       </w:r>
     </w:p>
     <w:p>
       <w:r>
-        <w:t>Programmamanager AZWA (~0,8 fte), beleidsadviseur sociaal domein (~0,4 fte), beleidsadviseur publieke gezondheid (~0,4 fte), beleidsadviseur jeugd (~0,2 fte), controller (~0,2 fte), projectleiders WP3 en WP4 (~0,4 fte tijdelijk). Regionale capaciteit delen via GGD Flevoland en mandaatgemeente.</w:t>
+        <w:t>De beschikbare openbare stukken geven geen concrete onderbouwing voor de benodigde personele inzet in Almere. Dit plan noemt daarom geen fte's of capaciteitsverdeling.</w:t>
+      </w:r>
+    </w:p>
+    <w:p>
+      <w:r>
+        <w:t>Te bepalen is welke capaciteit nodig is voor:</w:t>
+      </w:r>
+    </w:p>
+    <w:p>
+      <w:pPr>
+        <w:pStyle w:val="ListBullet"/>
+      </w:pPr>
+      <w:r>
+        <w:t>bestuurlijke en ambtelijke coordinatie;</w:t>
+      </w:r>
+    </w:p>
+    <w:p>
+      <w:pPr>
+        <w:pStyle w:val="ListBullet"/>
+      </w:pPr>
+      <w:r>
+        <w:t>beleidsuitwerking sociaal domein en gezondheid;</w:t>
+      </w:r>
+    </w:p>
+    <w:p>
+      <w:pPr>
+        <w:pStyle w:val="ListBullet"/>
+      </w:pPr>
+      <w:r>
+        <w:t>financiele uitwerking;</w:t>
+      </w:r>
+    </w:p>
+    <w:p>
+      <w:pPr>
+        <w:pStyle w:val="ListBullet"/>
+      </w:pPr>
+      <w:r>
+        <w:t>regionale afstemming;</w:t>
+      </w:r>
+    </w:p>
+    <w:p>
+      <w:pPr>
+        <w:pStyle w:val="ListBullet"/>
+      </w:pPr>
+      <w:r>
+        <w:t>monitoring;</w:t>
+      </w:r>
+    </w:p>
+    <w:p>
+      <w:pPr>
+        <w:pStyle w:val="ListBullet"/>
+      </w:pPr>
+      <w:r>
+        <w:t>communicatie en participatie.</w:t>
+      </w:r>
+    </w:p>
+    <w:p>
+      <w:r>
+        <w:t>Ook moet worden bepaald welk deel daarvan binnen bestaande capaciteit, regionale samenwerking of aanvullende inzet kan worden georganiseerd.</w:t>
       </w:r>
     </w:p>
     <w:p>
@@ -200,7 +652,17 @@
         <w:pStyle w:val="Heading2"/>
       </w:pPr>
       <w:r>
-        <w:t>Concrete acties en planning</w:t>
+        <w:t>11. Monitoring en verantwoording</w:t>
+      </w:r>
+    </w:p>
+    <w:p>
+      <w:r>
+        <w:t>De landelijke stukken leggen nadruk op monitoring, leren en bijsturing. Voor Almere is nog te bepalen hoe lokale voortgang wordt gevolgd en hoe die wordt verbonden met regionale en landelijke cycli.</w:t>
+      </w:r>
+    </w:p>
+    <w:p>
+      <w:r>
+        <w:t>Te beoordelen vragen zijn:</w:t>
       </w:r>
     </w:p>
     <w:p>
@@ -208,7 +670,7 @@
         <w:pStyle w:val="ListBullet"/>
       </w:pPr>
       <w:r>
-        <w:t>Najaar 2025: bijdragen aan landelijke scan (ZN/VNG/VWS).</w:t>
+        <w:t>welke indicatoren lokaal nodig zijn;</w:t>
       </w:r>
     </w:p>
     <w:p>
@@ -216,7 +678,7 @@
         <w:pStyle w:val="ListBullet"/>
       </w:pPr>
       <w:r>
-        <w:t>Q4 2025: landelijk kader vastgesteld in BO IZA/AZWA; collegebesluit uitgangspunten.</w:t>
+        <w:t>welke informatie al beschikbaar is;</w:t>
       </w:r>
     </w:p>
     <w:p>
@@ -224,7 +686,7 @@
         <w:pStyle w:val="ListBullet"/>
       </w:pPr>
       <w:r>
-        <w:t>Q1 2026: landelijke afspraken D6 beschikbaar; ontwikkelagenda 1 geprioriteerd; regionale regie op ketenaanpakken vastgelegd.</w:t>
+        <w:t>hoe lokale monitoring aansluit op Flevolandse en landelijke afspraken;</w:t>
       </w:r>
     </w:p>
     <w:p>
@@ -232,7 +694,7 @@
         <w:pStyle w:val="ListBullet"/>
       </w:pPr>
       <w:r>
-        <w:t>Q2 2026: meicirculaire verwerkt in Almeerse begroting 2027.</w:t>
+        <w:t>hoe de raad over voortgang wordt geinformeerd;</w:t>
       </w:r>
     </w:p>
     <w:p>
@@ -240,7 +702,25 @@
         <w:pStyle w:val="ListBullet"/>
       </w:pPr>
       <w:r>
-        <w:t>Eind september 2026: regionaal aanvullend plan opgeleverd.</w:t>
+        <w:t>hoe open punten en afhankelijkheden zichtbaar blijven.</w:t>
+      </w:r>
+    </w:p>
+    <w:p>
+      <w:r>
+        <w:t>Dit concept stelt nog geen KPI-set of rapportageritme vast.</w:t>
+      </w:r>
+    </w:p>
+    <w:p>
+      <w:pPr>
+        <w:pStyle w:val="Heading2"/>
+      </w:pPr>
+      <w:r>
+        <w:t>12. Aandachtspunten en afhankelijkheden</w:t>
+      </w:r>
+    </w:p>
+    <w:p>
+      <w:r>
+        <w:t>Voor verdere uitwerking zijn in ieder geval de volgende aandachtspunten relevant:</w:t>
       </w:r>
     </w:p>
     <w:p>
@@ -248,7 +728,7 @@
         <w:pStyle w:val="ListBullet"/>
       </w:pPr>
       <w:r>
-        <w:t>1 januari 2027: robuuste continuïteit ANW/crisisdiensten operationeel in Flevoland.</w:t>
+        <w:t>de landelijke bekostigingsroute is nog in uitwerking;</w:t>
       </w:r>
     </w:p>
     <w:p>
@@ -256,7 +736,7 @@
         <w:pStyle w:val="ListBullet"/>
       </w:pPr>
       <w:r>
-        <w:t>2027-2028: doorbraakmiddelen (landelijk €100 mln per jaar) via Zvw-aanbieder.</w:t>
+        <w:t>de regionale werkagenda is bepalend voor de verbinding tussen inhoud en middelen;</w:t>
       </w:r>
     </w:p>
     <w:p>
@@ -264,7 +744,7 @@
         <w:pStyle w:val="ListBullet"/>
       </w:pPr>
       <w:r>
-        <w:t>Q4 2028: lokale teams in Almere volledig aangesloten.</w:t>
+        <w:t>lokale en regionale verantwoordelijkheden moeten helder worden onderscheiden;</w:t>
       </w:r>
     </w:p>
     <w:p>
@@ -272,7 +752,7 @@
         <w:pStyle w:val="ListBullet"/>
       </w:pPr>
       <w:r>
-        <w:t>2028: periodieke update basisfunctionaliteiten.</w:t>
+        <w:t>het gebruik van termen als lokale teams, wijkverbanden en basisinfrastructuur vraagt om eenduidige lokale duiding;</w:t>
       </w:r>
     </w:p>
     <w:p>
@@ -280,7 +760,20 @@
         <w:pStyle w:val="ListBullet"/>
       </w:pPr>
       <w:r>
-        <w:t>2030: landelijke dekking basisfunctionaliteiten.</w:t>
+        <w:t>de beschikbare Almeerse stukken bieden aanknopingspunten, maar nog geen volledig expliciet AZWA-D5/D6-kader;</w:t>
+      </w:r>
+    </w:p>
+    <w:p>
+      <w:pPr>
+        <w:pStyle w:val="ListBullet"/>
+      </w:pPr>
+      <w:r>
+        <w:t>interne planning, capaciteit en producten moeten nog door Almere worden bepaald.</w:t>
+      </w:r>
+    </w:p>
+    <w:p>
+      <w:r>
+        <w:t>Deze aandachtspunten zijn bedoeld als basis voor beoordeling en besluitvorming. Ze zijn geen vastgestelde beheersmaatregelen.</w:t>
       </w:r>
     </w:p>
     <w:p>
@@ -288,20 +781,12 @@
         <w:pStyle w:val="Heading2"/>
       </w:pPr>
       <w:r>
-        <w:t>Middelen en Financiën Meicirculaire</w:t>
+        <w:t>13. Vervolgstappen ter beoordeling</w:t>
       </w:r>
     </w:p>
     <w:p>
       <w:r>
-        <w:t>Gemeenten ontvangen middelen via de Financiële verhoudingenwet als vertrekpunt (p63, p66). Een nieuwe specifieke uitkering vraagt expliciete kabinetsbesluitvorming (p63). Almere vertaalt het aandeel jaarlijks via de meicirculaire, langs (i) decentralisatie-uitkering gemeentefonds voor D6-onderdelen, (ii) SPUK IZA (genoemd in D6-tabel p64), (iii) reguliere sociaal-domein- en publieke-gezondheid-middelen. Structurele financiering uit Zvw-besparing vereist (p62, p102): voldoende bewijslast, besparing via intensivering, dekking gehele looptijd, kabinetsbesluit. Voor concrete bedragen per AZWA-onderdeel: zie AZWA hoofdstuk 4 Financiën (p81) en Bijlagen 1-3 (p89-93).</w:t>
-      </w:r>
-    </w:p>
-    <w:p>
-      <w:pPr>
-        <w:pStyle w:val="Heading2"/>
-      </w:pPr>
-      <w:r>
-        <w:t>Risico's en beheersmaatregelen en randvoorwaarden</w:t>
+        <w:t>Voor de verdere uitwerking ligt het voor de hand om ambtelijk en bestuurlijk te bepalen:</w:t>
       </w:r>
     </w:p>
     <w:p>
@@ -309,7 +794,7 @@
         <w:pStyle w:val="ListBullet"/>
       </w:pPr>
       <w:r>
-        <w:t>Meicirculaire tijdig/duidelijk over D6-aandeel: scenario-analyse vooraf op basis van AZWA-bijlagen.</w:t>
+        <w:t>welke lokale D5- en D6-keuzes eerst moeten worden voorbereid;</w:t>
       </w:r>
     </w:p>
     <w:p>
@@ -317,7 +802,7 @@
         <w:pStyle w:val="ListBullet"/>
       </w:pPr>
       <w:r>
-        <w:t>Geen Zvw-aanbieder voor doorbraakmiddelen: actief partners werven (huisartsen, wijkverpleging, ggz).</w:t>
+        <w:t>welke regionale afspraken relevant zijn voor Almere;</w:t>
       </w:r>
     </w:p>
     <w:p>
@@ -325,7 +810,7 @@
         <w:pStyle w:val="ListBullet"/>
       </w:pPr>
       <w:r>
-        <w:t>Deadline Q4 2028 voor lokale teams krap: fasering vanaf 2026, start in wijken met hoogste zorgvraag.</w:t>
+        <w:t>welke financiele informatie nodig is voor besluitvorming;</w:t>
       </w:r>
     </w:p>
     <w:p>
@@ -333,7 +818,7 @@
         <w:pStyle w:val="ListBullet"/>
       </w:pPr>
       <w:r>
-        <w:t>Dubbele structuur met regioplan: één loket via mandaatgemeente; aansluiten op bestaand IZA-regioplan.</w:t>
+        <w:t>welke lokale documenten of besluiten nodig zijn om de AZWA-uitwerking openbaar en bestuurlijk herkenbaar te maken;</w:t>
       </w:r>
     </w:p>
     <w:p>
@@ -341,91 +826,12 @@
         <w:pStyle w:val="ListBullet"/>
       </w:pPr>
       <w:r>
-        <w:t>Randvoorwaarden: beschikbaarheid landelijke gereedschapskist, helderheid over financieringsvorm, tijdige Q1 2026-afspraken, bestuurlijk commitment regio.</w:t>
-      </w:r>
-    </w:p>
-    <w:p>
-      <w:pPr>
-        <w:pStyle w:val="Heading2"/>
-      </w:pPr>
-      <w:r>
-        <w:t>Monitoring en evaluatie</w:t>
+        <w:t>hoe de raad, regionale partners en uitvoeringspartijen worden betrokken.</w:t>
       </w:r>
     </w:p>
     <w:p>
       <w:r>
-        <w:t>Drie niveaus conform Bijlage D5 (p104): uitvoering, (kosten)effectiviteit en werking mechanisme. Aansluiten bij bestaande gegevensbronnen en reguliere verantwoording aan de gemeenteraad (p63, p102). Tussentijdse herijking basisfunctionaliteiten in 2028 op basis van (boven)lokale monitoring (p62).</w:t>
-      </w:r>
-    </w:p>
-    <w:p>
-      <w:pPr>
-        <w:pStyle w:val="Heading2"/>
-      </w:pPr>
-      <w:r>
-        <w:t>Communicatie en participatie</w:t>
-      </w:r>
-    </w:p>
-    <w:p>
-      <w:r>
-        <w:t>Publicatie lokale AZWA-positie op raadvanalmere.nl uiterlijk Q1 2026. Participatie via bestaande wijk- en regionale overleggen met sociaal werk, huisartsen, wijkverpleging, ggz, jeugdhulp, onderwijs, sport. Expliciete ondersteuning burgerinitiatieven als onderdeel van D6 (p64).</w:t>
-      </w:r>
-    </w:p>
-    <w:p>
-      <w:pPr>
-        <w:pStyle w:val="Heading2"/>
-      </w:pPr>
-      <w:r>
-        <w:t>Besluitvorming en vervolgstappen</w:t>
-      </w:r>
-    </w:p>
-    <w:p>
-      <w:r>
-        <w:t>Collegebesluit Q4 2025 over uitgangspunten en trekkers. Raadinformatiebrief bij meicirculaire 2027. Collegebesluit bij oplevering regionaal plan (september 2026). Raadsevaluatie begin 2027. Vervolgbesluit in 2028 bij periodieke herijking.</w:t>
-      </w:r>
-    </w:p>
-    <w:p>
-      <w:pPr>
-        <w:pStyle w:val="Heading2"/>
-      </w:pPr>
-      <w:r>
-        <w:t>Verantwoording</w:t>
-      </w:r>
-    </w:p>
-    <w:p>
-      <w:r>
-        <w:t>Gemeenteraad Almere via P&amp;C-cyclus en jaarlijkse AZWA-voortgangsrapportage. Regionaal via mandaatgemeente en aangevuld regioplan. Landelijk via BO IZA/AZWA-monitoring. Wederkerige aanspreekbaarheid tussen gemeente, zorgverzekeraars en aanbieders (p101).</w:t>
-      </w:r>
-    </w:p>
-    <w:p>
-      <w:pPr>
-        <w:pStyle w:val="Heading2"/>
-      </w:pPr>
-      <w:r>
-        <w:t>Bijlagen</w:t>
-      </w:r>
-    </w:p>
-    <w:p>
-      <w:pPr>
-        <w:pStyle w:val="ListBullet"/>
-      </w:pPr>
-      <w:r>
-        <w:t>A. Bronverwijzing AZWA content p60-66 en p100-104.</w:t>
-      </w:r>
-    </w:p>
-    <w:p>
-      <w:pPr>
-        <w:pStyle w:val="ListBullet"/>
-      </w:pPr>
-      <w:r>
-        <w:t>B. Overzicht basisfunctionaliteiten (Tabel 1, p61) en D6-basisinfrastructuur (tabellen p64).</w:t>
-      </w:r>
-    </w:p>
-    <w:p>
-      <w:pPr>
-        <w:pStyle w:val="ListBullet"/>
-      </w:pPr>
-      <w:r>
-        <w:t>C. Landelijke mijlpalen: najaar 2025, Q4 2025, Q1 2026, september 2026, 1-1-2027, 2027-2028, Q4 2028, 2028, 2030.</w:t>
+        <w:t>De uitkomst van die beoordeling bepaalt of en hoe dit concept wordt omgezet in een vastgesteld lokaal plan van aanpak.</w:t>
       </w:r>
     </w:p>
     <w:sectPr>

</xml_diff>